<commit_message>
Dodaj godzine egzaminu, endpoint resend-activation i ulepszony ekran sukcesu zapisu
- Model Course: nowe pole exam_time (TimeField), migracja 0005_add_exam_time
- Serializer: exam_time w obu serializerach
- documents/views.py: exam_time w kontekscie szablonow (format HH:MM)
- Szablony file4.docx, file5.docx: zaktualizowane
- users/views.py: nowy ResendActivationView (POST /api/users/resend-activation/)
- users/urls.py: nowy URL resend-activation/
- api/courses.js: funkcja resendActivation(email)
- CourseCreate/CourseDetail: pole Godzina egzaminu (type=time) w formularzu
- EnrollForm: ekran sukcesu z adresem email, porada o spamie i przyciskiem ponownego wysylania linku

Co-Authored-By: Claude Sonnet 4.6 <noreply@anthropic.com>
</commit_message>
<xml_diff>
--- a/backend/documents/templates/file4.docx
+++ b/backend/documents/templates/file4.docx
@@ -12,6 +12,7 @@
           <w:rFonts w:ascii="Times" w:eastAsia="Times" w:hAnsi="Times" w:cs="Times"/>
           <w:sz w:val="16"/>
           <w:szCs w:val="16"/>
+          <w:lang w:val="en-US"/>
         </w:rPr>
       </w:pPr>
       <w:r>
@@ -19,32 +20,59 @@
           <w:rFonts w:ascii="Times" w:eastAsia="Times" w:hAnsi="Times" w:cs="Times"/>
           <w:sz w:val="16"/>
           <w:szCs w:val="16"/>
-        </w:rPr>
-        <w:t xml:space="preserve">                                                                                                                                                           Ełk, dn.</w:t>
-      </w:r>
-      <w:r>
-        <w:t xml:space="preserve"> </w:t>
-      </w:r>
-      <w:r>
-        <w:rPr>
+          <w:lang w:val="en-US"/>
+        </w:rPr>
+        <w:t xml:space="preserve">                                                                                                                                                           </w:t>
+      </w:r>
+      <w:proofErr w:type="spellStart"/>
+      <w:r>
+        <w:rPr>
+          <w:rFonts w:ascii="Times" w:eastAsia="Times" w:hAnsi="Times" w:cs="Times"/>
           <w:sz w:val="16"/>
           <w:szCs w:val="16"/>
-        </w:rPr>
-        <w:t xml:space="preserve">{{ </w:t>
-      </w:r>
-      <w:proofErr w:type="spellStart"/>
-      <w:r>
-        <w:rPr>
+          <w:lang w:val="en-US"/>
+        </w:rPr>
+        <w:t>Ełk</w:t>
+      </w:r>
+      <w:proofErr w:type="spellEnd"/>
+      <w:r>
+        <w:rPr>
+          <w:rFonts w:ascii="Times" w:eastAsia="Times" w:hAnsi="Times" w:cs="Times"/>
           <w:sz w:val="16"/>
           <w:szCs w:val="16"/>
-        </w:rPr>
-        <w:t>created_at</w:t>
-      </w:r>
-      <w:proofErr w:type="spellEnd"/>
+          <w:lang w:val="en-US"/>
+        </w:rPr>
+        <w:t>, dn.</w:t>
+      </w:r>
+      <w:r>
+        <w:rPr>
+          <w:lang w:val="en-US"/>
+        </w:rPr>
+        <w:t xml:space="preserve"> </w:t>
+      </w:r>
       <w:r>
         <w:rPr>
           <w:sz w:val="16"/>
           <w:szCs w:val="16"/>
+          <w:lang w:val="en-US"/>
+        </w:rPr>
+        <w:t xml:space="preserve">{{ </w:t>
+      </w:r>
+      <w:proofErr w:type="spellStart"/>
+      <w:r>
+        <w:rPr>
+          <w:sz w:val="16"/>
+          <w:szCs w:val="16"/>
+          <w:lang w:val="en-US"/>
+        </w:rPr>
+        <w:t>created_at</w:t>
+      </w:r>
+      <w:proofErr w:type="spellEnd"/>
+      <w:r>
+        <w:rPr>
+          <w:sz w:val="16"/>
+          <w:szCs w:val="16"/>
+          <w:lang w:val="en-US"/>
         </w:rPr>
         <w:t xml:space="preserve"> }}</w:t>
       </w:r>
@@ -60,6 +88,7 @@
           <w:iCs/>
           <w:sz w:val="16"/>
           <w:szCs w:val="16"/>
+          <w:lang w:val="en-US"/>
         </w:rPr>
       </w:pPr>
       <w:r>
@@ -67,6 +96,7 @@
           <w:i/>
           <w:sz w:val="16"/>
           <w:szCs w:val="16"/>
+          <w:lang w:val="en-US"/>
         </w:rPr>
         <w:tab/>
       </w:r>
@@ -77,33 +107,61 @@
           <w:iCs/>
           <w:sz w:val="16"/>
           <w:szCs w:val="16"/>
-        </w:rPr>
-        <w:t>(miejscowość, data)</w:t>
+          <w:lang w:val="en-US"/>
+        </w:rPr>
+        <w:t>(</w:t>
+      </w:r>
+      <w:proofErr w:type="spellStart"/>
+      <w:r>
+        <w:rPr>
+          <w:rFonts w:ascii="Times" w:eastAsia="Times" w:hAnsi="Times" w:cs="Times"/>
+          <w:i/>
+          <w:iCs/>
+          <w:sz w:val="16"/>
+          <w:szCs w:val="16"/>
+          <w:lang w:val="en-US"/>
+        </w:rPr>
+        <w:t>miejscowość</w:t>
+      </w:r>
+      <w:proofErr w:type="spellEnd"/>
+      <w:r>
+        <w:rPr>
+          <w:rFonts w:ascii="Times" w:eastAsia="Times" w:hAnsi="Times" w:cs="Times"/>
+          <w:i/>
+          <w:iCs/>
+          <w:sz w:val="16"/>
+          <w:szCs w:val="16"/>
+          <w:lang w:val="en-US"/>
+        </w:rPr>
+        <w:t>, data)</w:t>
       </w:r>
       <w:r>
         <w:rPr>
           <w:i/>
           <w:sz w:val="16"/>
           <w:szCs w:val="16"/>
-        </w:rPr>
-        <w:tab/>
-      </w:r>
-    </w:p>
-    <w:p>
-      <w:pPr>
-        <w:rPr>
-          <w:rFonts w:ascii="Times" w:eastAsia="Times" w:hAnsi="Times" w:cs="Times"/>
-          <w:b/>
-          <w:bCs/>
-        </w:rPr>
-      </w:pPr>
-    </w:p>
-    <w:p>
-      <w:pPr>
-        <w:rPr>
-          <w:rFonts w:ascii="Times" w:eastAsia="Times" w:hAnsi="Times" w:cs="Times"/>
-          <w:b/>
-          <w:bCs/>
+          <w:lang w:val="en-US"/>
+        </w:rPr>
+        <w:tab/>
+      </w:r>
+    </w:p>
+    <w:p>
+      <w:pPr>
+        <w:rPr>
+          <w:rFonts w:ascii="Times" w:eastAsia="Times" w:hAnsi="Times" w:cs="Times"/>
+          <w:b/>
+          <w:bCs/>
+          <w:lang w:val="en-US"/>
+        </w:rPr>
+      </w:pPr>
+    </w:p>
+    <w:p>
+      <w:pPr>
+        <w:rPr>
+          <w:rFonts w:ascii="Times" w:eastAsia="Times" w:hAnsi="Times" w:cs="Times"/>
+          <w:b/>
+          <w:bCs/>
+          <w:lang w:val="en-US"/>
         </w:rPr>
       </w:pPr>
     </w:p>
@@ -284,7 +342,17 @@
           <w:sz w:val="32"/>
           <w:szCs w:val="32"/>
         </w:rPr>
-        <w:t>22CD</w:t>
+        <w:t>22C</w:t>
+      </w:r>
+      <w:r>
+        <w:rPr>
+          <w:rFonts w:ascii="Times" w:eastAsia="Times" w:hAnsi="Times" w:cs="Times"/>
+          <w:b/>
+          <w:bCs/>
+          <w:sz w:val="32"/>
+          <w:szCs w:val="32"/>
+        </w:rPr>
+        <w:t>G</w:t>
       </w:r>
     </w:p>
     <w:p>
@@ -645,13 +713,11 @@
         <w:rPr>
           <w:rFonts w:ascii="Times" w:eastAsia="Times" w:hAnsi="Times" w:cs="Times"/>
           <w:shd w:val="clear" w:color="auto" w:fill="FFFFFF"/>
-          <w:lang w:val="en-US"/>
-        </w:rPr>
-      </w:pPr>
-      <w:r>
-        <w:rPr>
-          <w:rFonts w:ascii="Times" w:eastAsia="Times" w:hAnsi="Times" w:cs="Times"/>
-          <w:lang w:val="en-US"/>
+        </w:rPr>
+      </w:pPr>
+      <w:r>
+        <w:rPr>
+          <w:rFonts w:ascii="Times" w:eastAsia="Times" w:hAnsi="Times" w:cs="Times"/>
         </w:rPr>
         <w:lastRenderedPageBreak/>
         <w:t>7</w:t>
@@ -659,116 +725,56 @@
       <w:r>
         <w:rPr>
           <w:rFonts w:ascii="Times" w:eastAsia="Times" w:hAnsi="Times" w:cs="Times"/>
-          <w:lang w:val="en-US"/>
         </w:rPr>
         <w:t>.</w:t>
       </w:r>
       <w:r>
         <w:rPr>
           <w:rFonts w:ascii="Times" w:eastAsia="Times" w:hAnsi="Times" w:cs="Times"/>
-          <w:lang w:val="en-US"/>
-        </w:rPr>
-        <w:t xml:space="preserve"> Termin </w:t>
+        </w:rPr>
+        <w:t xml:space="preserve"> Termin i miejsce egzaminu:</w:t>
+      </w:r>
+      <w:r>
+        <w:br/>
+      </w:r>
+      <w:r>
+        <w:t xml:space="preserve">{{ </w:t>
       </w:r>
       <w:proofErr w:type="spellStart"/>
       <w:r>
-        <w:rPr>
-          <w:rFonts w:ascii="Times" w:eastAsia="Times" w:hAnsi="Times" w:cs="Times"/>
-          <w:lang w:val="en-US"/>
-        </w:rPr>
-        <w:t>i</w:t>
+        <w:t>exam_location</w:t>
       </w:r>
       <w:proofErr w:type="spellEnd"/>
       <w:r>
-        <w:rPr>
-          <w:rFonts w:ascii="Times" w:eastAsia="Times" w:hAnsi="Times" w:cs="Times"/>
-          <w:lang w:val="en-US"/>
-        </w:rPr>
+        <w:t xml:space="preserve"> }}, {{ </w:t>
+      </w:r>
+      <w:proofErr w:type="spellStart"/>
+      <w:r>
+        <w:t>exam_date</w:t>
+      </w:r>
+      <w:proofErr w:type="spellEnd"/>
+      <w:r>
+        <w:t xml:space="preserve"> }}</w:t>
+      </w:r>
+      <w:r>
         <w:t xml:space="preserve"> </w:t>
       </w:r>
+      <w:r>
+        <w:t>,</w:t>
+      </w:r>
+      <w:r>
+        <w:t xml:space="preserve"> </w:t>
+      </w:r>
+      <w:r>
+        <w:t>{{</w:t>
+      </w:r>
       <w:proofErr w:type="spellStart"/>
       <w:r>
-        <w:rPr>
-          <w:rFonts w:ascii="Times" w:eastAsia="Times" w:hAnsi="Times" w:cs="Times"/>
-          <w:lang w:val="en-US"/>
-        </w:rPr>
-        <w:t>miejsce</w:t>
+        <w:t>exam_time</w:t>
       </w:r>
       <w:proofErr w:type="spellEnd"/>
       <w:r>
-        <w:rPr>
-          <w:rFonts w:ascii="Times" w:eastAsia="Times" w:hAnsi="Times" w:cs="Times"/>
-          <w:lang w:val="en-US"/>
-        </w:rPr>
-        <w:t xml:space="preserve"> </w:t>
-      </w:r>
-      <w:proofErr w:type="spellStart"/>
-      <w:r>
-        <w:rPr>
-          <w:rFonts w:ascii="Times" w:eastAsia="Times" w:hAnsi="Times" w:cs="Times"/>
-          <w:lang w:val="en-US"/>
-        </w:rPr>
-        <w:t>egzaminu</w:t>
-      </w:r>
-      <w:proofErr w:type="spellEnd"/>
-      <w:r>
-        <w:rPr>
-          <w:rFonts w:ascii="Times" w:eastAsia="Times" w:hAnsi="Times" w:cs="Times"/>
-          <w:lang w:val="en-US"/>
-        </w:rPr>
-        <w:t>:</w:t>
-      </w:r>
-      <w:r>
-        <w:rPr>
-          <w:lang w:val="en-US"/>
-        </w:rPr>
-        <w:br/>
-      </w:r>
-      <w:r>
-        <w:rPr>
-          <w:lang w:val="en-US"/>
-        </w:rPr>
-        <w:t xml:space="preserve">{{ </w:t>
-      </w:r>
-      <w:proofErr w:type="spellStart"/>
-      <w:r>
-        <w:rPr>
-          <w:lang w:val="en-US"/>
-        </w:rPr>
-        <w:t>exam_location</w:t>
-      </w:r>
-      <w:proofErr w:type="spellEnd"/>
-      <w:r>
-        <w:rPr>
-          <w:lang w:val="en-US"/>
-        </w:rPr>
-        <w:t xml:space="preserve"> }}</w:t>
-      </w:r>
-      <w:r>
-        <w:rPr>
-          <w:lang w:val="en-US"/>
-        </w:rPr>
-        <w:t xml:space="preserve">, </w:t>
-      </w:r>
-      <w:r>
-        <w:rPr>
-          <w:lang w:val="en-US"/>
-        </w:rPr>
-        <w:t xml:space="preserve">{{ </w:t>
-      </w:r>
-      <w:proofErr w:type="spellStart"/>
-      <w:r>
-        <w:rPr>
-          <w:lang w:val="en-US"/>
-        </w:rPr>
-        <w:t>exam_date</w:t>
-      </w:r>
-      <w:proofErr w:type="spellEnd"/>
-      <w:r>
-        <w:rPr>
-          <w:lang w:val="en-US"/>
-        </w:rPr>
-        <w:t xml:space="preserve"> }}</w:t>
+        <w:t>}}</w:t>
       </w:r>
     </w:p>
     <w:p>

</xml_diff>

<commit_message>
Poprawki szablonów xlsx, maile HTML, panel admina i formularz kursu
- xlsx: napraw podmianę zmiennych (spacje w {{ }}, pola Decimal)
- Dodaj ładny HTML mail do uczestników kursu (styl jak mail aktywacyjny)
- Panel admina: usuń Dashboard, /admin przekierowuje na /admin/courses
- Psycholog zapisywany bez tytułu (nameOnly w InstSelect)
- Instruktorzy: staż pracy jako CharField, nowe migracje
- Szablony docx zaktualizowane

Co-Authored-By: Claude Sonnet 4.6 <noreply@anthropic.com>
</commit_message>
<xml_diff>
--- a/backend/documents/templates/file4.docx
+++ b/backend/documents/templates/file4.docx
@@ -1,6 +1,6 @@
 
 <file path=word/document.xml><?xml version="1.0" encoding="utf-8"?>
-<w:document xmlns:wpc="http://schemas.microsoft.com/office/word/2010/wordprocessingCanvas" xmlns:cx="http://schemas.microsoft.com/office/drawing/2014/chartex" xmlns:cx1="http://schemas.microsoft.com/office/drawing/2015/9/8/chartex" xmlns:cx2="http://schemas.microsoft.com/office/drawing/2015/10/21/chartex" xmlns:cx3="http://schemas.microsoft.com/office/drawing/2016/5/9/chartex" xmlns:cx4="http://schemas.microsoft.com/office/drawing/2016/5/10/chartex" xmlns:cx5="http://schemas.microsoft.com/office/drawing/2016/5/11/chartex" xmlns:cx6="http://schemas.microsoft.com/office/drawing/2016/5/12/chartex" xmlns:cx7="http://schemas.microsoft.com/office/drawing/2016/5/13/chartex" xmlns:cx8="http://schemas.microsoft.com/office/drawing/2016/5/14/chartex" xmlns:mc="http://schemas.openxmlformats.org/markup-compatibility/2006" xmlns:aink="http://schemas.microsoft.com/office/drawing/2016/ink" xmlns:am3d="http://schemas.microsoft.com/office/drawing/2017/model3d" xmlns:o="urn:schemas-microsoft-com:office:office" xmlns:oel="http://schemas.microsoft.com/office/2019/extlst" xmlns:r="http://schemas.openxmlformats.org/officeDocument/2006/relationships" xmlns:m="http://schemas.openxmlformats.org/officeDocument/2006/math" xmlns:v="urn:schemas-microsoft-com:vml" xmlns:wp14="http://schemas.microsoft.com/office/word/2010/wordprocessingDrawing" xmlns:wp="http://schemas.openxmlformats.org/drawingml/2006/wordprocessingDrawing" xmlns:w10="urn:schemas-microsoft-com:office:word" xmlns:w="http://schemas.openxmlformats.org/wordprocessingml/2006/main" xmlns:w14="http://schemas.microsoft.com/office/word/2010/wordml" xmlns:w15="http://schemas.microsoft.com/office/word/2012/wordml" xmlns:w16cex="http://schemas.microsoft.com/office/word/2018/wordml/cex" xmlns:w16cid="http://schemas.microsoft.com/office/word/2016/wordml/cid" xmlns:w16="http://schemas.microsoft.com/office/word/2018/wordml" xmlns:w16du="http://schemas.microsoft.com/office/word/2023/wordml/word16du" xmlns:w16sdtdh="http://schemas.microsoft.com/office/word/2020/wordml/sdtdatahash" xmlns:w16sdtfl="http://schemas.microsoft.com/office/word/2024/wordml/sdtformatlock" xmlns:w16se="http://schemas.microsoft.com/office/word/2015/wordml/symex" xmlns:wpg="http://schemas.microsoft.com/office/word/2010/wordprocessingGroup" xmlns:wpi="http://schemas.microsoft.com/office/word/2010/wordprocessingInk" xmlns:wne="http://schemas.microsoft.com/office/word/2006/wordml" xmlns:wps="http://schemas.microsoft.com/office/word/2010/wordprocessingShape" mc:Ignorable="w14 w15 w16se w16cid w16 w16cex w16sdtdh w16sdtfl w16du wp14">
+<w:document xmlns:wpc="http://schemas.microsoft.com/office/word/2010/wordprocessingCanvas" xmlns:cx="http://schemas.microsoft.com/office/drawing/2014/chartex" xmlns:cx1="http://schemas.microsoft.com/office/drawing/2015/9/8/chartex" xmlns:cx2="http://schemas.microsoft.com/office/drawing/2015/10/21/chartex" xmlns:cx3="http://schemas.microsoft.com/office/drawing/2016/5/9/chartex" xmlns:cx4="http://schemas.microsoft.com/office/drawing/2016/5/10/chartex" xmlns:cx5="http://schemas.microsoft.com/office/drawing/2016/5/11/chartex" xmlns:cx6="http://schemas.microsoft.com/office/drawing/2016/5/12/chartex" xmlns:cx7="http://schemas.microsoft.com/office/drawing/2016/5/13/chartex" xmlns:cx8="http://schemas.microsoft.com/office/drawing/2016/5/14/chartex" xmlns:mc="http://schemas.openxmlformats.org/markup-compatibility/2006" xmlns:aink="http://schemas.microsoft.com/office/drawing/2016/ink" xmlns:am3d="http://schemas.microsoft.com/office/drawing/2017/model3d" xmlns:o="urn:schemas-microsoft-com:office:office" xmlns:oel="http://schemas.microsoft.com/office/2019/extlst" xmlns:r="http://schemas.openxmlformats.org/officeDocument/2006/relationships" xmlns:m="http://schemas.openxmlformats.org/officeDocument/2006/math" xmlns:v="urn:schemas-microsoft-com:vml" xmlns:wp14="http://schemas.microsoft.com/office/word/2010/wordprocessingDrawing" xmlns:wp="http://schemas.openxmlformats.org/drawingml/2006/wordprocessingDrawing" xmlns:w10="urn:schemas-microsoft-com:office:word" xmlns:w="http://schemas.openxmlformats.org/wordprocessingml/2006/main" xmlns:w14="http://schemas.microsoft.com/office/word/2010/wordml" xmlns:w15="http://schemas.microsoft.com/office/word/2012/wordml" xmlns:w16cei="http://schemas.microsoft.com/office/word/2026/wordml/cei" xmlns:w16cex="http://schemas.microsoft.com/office/word/2018/wordml/cex" xmlns:w16cid="http://schemas.microsoft.com/office/word/2016/wordml/cid" xmlns:w16="http://schemas.microsoft.com/office/word/2018/wordml" xmlns:w16du="http://schemas.microsoft.com/office/word/2023/wordml/word16du" xmlns:w16sdtdh="http://schemas.microsoft.com/office/word/2020/wordml/sdtdatahash" xmlns:w16sdtfl="http://schemas.microsoft.com/office/word/2024/wordml/sdtformatlock" xmlns:w16se="http://schemas.microsoft.com/office/word/2015/wordml/symex" xmlns:wpg="http://schemas.microsoft.com/office/word/2010/wordprocessingGroup" xmlns:wpi="http://schemas.microsoft.com/office/word/2010/wordprocessingInk" xmlns:wne="http://schemas.microsoft.com/office/word/2006/wordml" xmlns:wps="http://schemas.microsoft.com/office/word/2010/wordprocessingShape" mc:Ignorable="w14 w15 w16se w16cid w16 w16cex w16sdtdh w16sdtfl w16du wp14">
   <w:body>
     <w:p>
       <w:pPr>
@@ -22,59 +22,21 @@
           <w:szCs w:val="16"/>
           <w:lang w:val="en-US"/>
         </w:rPr>
-        <w:t xml:space="preserve">                                                                                                                                                           </w:t>
-      </w:r>
-      <w:proofErr w:type="spellStart"/>
-      <w:r>
-        <w:rPr>
-          <w:rFonts w:ascii="Times" w:eastAsia="Times" w:hAnsi="Times" w:cs="Times"/>
+        <w:t xml:space="preserve">                                                                                                                                                           Ełk, dn.</w:t>
+      </w:r>
+      <w:r>
+        <w:rPr>
+          <w:lang w:val="en-US"/>
+        </w:rPr>
+        <w:t xml:space="preserve"> </w:t>
+      </w:r>
+      <w:r>
+        <w:rPr>
           <w:sz w:val="16"/>
           <w:szCs w:val="16"/>
           <w:lang w:val="en-US"/>
         </w:rPr>
-        <w:t>Ełk</w:t>
-      </w:r>
-      <w:proofErr w:type="spellEnd"/>
-      <w:r>
-        <w:rPr>
-          <w:rFonts w:ascii="Times" w:eastAsia="Times" w:hAnsi="Times" w:cs="Times"/>
-          <w:sz w:val="16"/>
-          <w:szCs w:val="16"/>
-          <w:lang w:val="en-US"/>
-        </w:rPr>
-        <w:t>, dn.</w:t>
-      </w:r>
-      <w:r>
-        <w:rPr>
-          <w:lang w:val="en-US"/>
-        </w:rPr>
-        <w:t xml:space="preserve"> </w:t>
-      </w:r>
-      <w:r>
-        <w:rPr>
-          <w:sz w:val="16"/>
-          <w:szCs w:val="16"/>
-          <w:lang w:val="en-US"/>
-        </w:rPr>
-        <w:t xml:space="preserve">{{ </w:t>
-      </w:r>
-      <w:proofErr w:type="spellStart"/>
-      <w:r>
-        <w:rPr>
-          <w:sz w:val="16"/>
-          <w:szCs w:val="16"/>
-          <w:lang w:val="en-US"/>
-        </w:rPr>
-        <w:t>created_at</w:t>
-      </w:r>
-      <w:proofErr w:type="spellEnd"/>
-      <w:r>
-        <w:rPr>
-          <w:sz w:val="16"/>
-          <w:szCs w:val="16"/>
-          <w:lang w:val="en-US"/>
-        </w:rPr>
-        <w:t xml:space="preserve"> }}</w:t>
+        <w:t>{{ created_at }}</w:t>
       </w:r>
     </w:p>
     <w:p>
@@ -109,31 +71,7 @@
           <w:szCs w:val="16"/>
           <w:lang w:val="en-US"/>
         </w:rPr>
-        <w:t>(</w:t>
-      </w:r>
-      <w:proofErr w:type="spellStart"/>
-      <w:r>
-        <w:rPr>
-          <w:rFonts w:ascii="Times" w:eastAsia="Times" w:hAnsi="Times" w:cs="Times"/>
-          <w:i/>
-          <w:iCs/>
-          <w:sz w:val="16"/>
-          <w:szCs w:val="16"/>
-          <w:lang w:val="en-US"/>
-        </w:rPr>
-        <w:t>miejscowość</w:t>
-      </w:r>
-      <w:proofErr w:type="spellEnd"/>
-      <w:r>
-        <w:rPr>
-          <w:rFonts w:ascii="Times" w:eastAsia="Times" w:hAnsi="Times" w:cs="Times"/>
-          <w:i/>
-          <w:iCs/>
-          <w:sz w:val="16"/>
-          <w:szCs w:val="16"/>
-          <w:lang w:val="en-US"/>
-        </w:rPr>
-        <w:t>, data)</w:t>
+        <w:t>(miejscowość, data)</w:t>
       </w:r>
       <w:r>
         <w:rPr>
@@ -274,7 +212,27 @@
           <w:sz w:val="32"/>
           <w:szCs w:val="32"/>
         </w:rPr>
-        <w:t>Cruściele</w:t>
+        <w:t>C</w:t>
+      </w:r>
+      <w:r>
+        <w:rPr>
+          <w:rFonts w:ascii="Times" w:eastAsia="Times" w:hAnsi="Times" w:cs="Times"/>
+          <w:b/>
+          <w:bCs/>
+          <w:sz w:val="32"/>
+          <w:szCs w:val="32"/>
+        </w:rPr>
+        <w:t>h</w:t>
+      </w:r>
+      <w:r>
+        <w:rPr>
+          <w:rFonts w:ascii="Times" w:eastAsia="Times" w:hAnsi="Times" w:cs="Times"/>
+          <w:b/>
+          <w:bCs/>
+          <w:sz w:val="32"/>
+          <w:szCs w:val="32"/>
+        </w:rPr>
+        <w:t>ruściele</w:t>
       </w:r>
       <w:r>
         <w:rPr>
@@ -576,15 +534,7 @@
         <w:t xml:space="preserve"> </w:t>
       </w:r>
       <w:r>
-        <w:t xml:space="preserve">{{ </w:t>
-      </w:r>
-      <w:proofErr w:type="spellStart"/>
-      <w:r>
-        <w:t>address</w:t>
-      </w:r>
-      <w:proofErr w:type="spellEnd"/>
-      <w:r>
-        <w:t xml:space="preserve"> }}</w:t>
+        <w:t>{{ address }}</w:t>
       </w:r>
     </w:p>
     <w:p>
@@ -674,7 +624,17 @@
           <w:sz w:val="32"/>
           <w:szCs w:val="32"/>
         </w:rPr>
-        <w:t xml:space="preserve">: mgr piel spec. piel. anestez. i intens. opieki, lic. ratownik medyczny Maciej Świerszcz </w:t>
+        <w:t xml:space="preserve">: </w:t>
+      </w:r>
+      <w:r>
+        <w:rPr>
+          <w:rFonts w:ascii="Times" w:eastAsia="Times" w:hAnsi="Times" w:cs="Times"/>
+          <w:b/>
+          <w:bCs/>
+          <w:sz w:val="32"/>
+          <w:szCs w:val="32"/>
+        </w:rPr>
+        <w:t>{{ academic_director }}</w:t>
       </w:r>
     </w:p>
     <w:p>
@@ -738,23 +698,7 @@
         <w:br/>
       </w:r>
       <w:r>
-        <w:t xml:space="preserve">{{ </w:t>
-      </w:r>
-      <w:proofErr w:type="spellStart"/>
-      <w:r>
-        <w:t>exam_location</w:t>
-      </w:r>
-      <w:proofErr w:type="spellEnd"/>
-      <w:r>
-        <w:t xml:space="preserve"> }}, {{ </w:t>
-      </w:r>
-      <w:proofErr w:type="spellStart"/>
-      <w:r>
-        <w:t>exam_date</w:t>
-      </w:r>
-      <w:proofErr w:type="spellEnd"/>
-      <w:r>
-        <w:t xml:space="preserve"> }}</w:t>
+        <w:t>{{ exam_location }}, {{ exam_date }}</w:t>
       </w:r>
       <w:r>
         <w:t xml:space="preserve"> </w:t>
@@ -763,18 +707,7 @@
         <w:t>,</w:t>
       </w:r>
       <w:r>
-        <w:t xml:space="preserve"> </w:t>
-      </w:r>
-      <w:r>
-        <w:t>{{</w:t>
-      </w:r>
-      <w:proofErr w:type="spellStart"/>
-      <w:r>
-        <w:t>exam_time</w:t>
-      </w:r>
-      <w:proofErr w:type="spellEnd"/>
-      <w:r>
-        <w:t>}}</w:t>
+        <w:t xml:space="preserve"> {{exam_time}}</w:t>
       </w:r>
     </w:p>
     <w:p>
@@ -827,27 +760,7 @@
           <w:sz w:val="32"/>
           <w:szCs w:val="32"/>
         </w:rPr>
-        <w:t xml:space="preserve">{{ </w:t>
-      </w:r>
-      <w:proofErr w:type="spellStart"/>
-      <w:r>
-        <w:rPr>
-          <w:b/>
-          <w:bCs/>
-          <w:sz w:val="32"/>
-          <w:szCs w:val="32"/>
-        </w:rPr>
-        <w:t>committee_chair</w:t>
-      </w:r>
-      <w:proofErr w:type="spellEnd"/>
-      <w:r>
-        <w:rPr>
-          <w:b/>
-          <w:bCs/>
-          <w:sz w:val="32"/>
-          <w:szCs w:val="32"/>
-        </w:rPr>
-        <w:t xml:space="preserve"> }}</w:t>
+        <w:t>{{ committee_chair }}</w:t>
       </w:r>
     </w:p>
     <w:p>
@@ -1015,27 +928,7 @@
           <w:sz w:val="32"/>
           <w:szCs w:val="32"/>
         </w:rPr>
-        <w:t xml:space="preserve">{{ </w:t>
-      </w:r>
-      <w:proofErr w:type="spellStart"/>
-      <w:r>
-        <w:rPr>
-          <w:b/>
-          <w:bCs/>
-          <w:sz w:val="32"/>
-          <w:szCs w:val="32"/>
-        </w:rPr>
-        <w:t>max_participants</w:t>
-      </w:r>
-      <w:proofErr w:type="spellEnd"/>
-      <w:r>
-        <w:rPr>
-          <w:b/>
-          <w:bCs/>
-          <w:sz w:val="32"/>
-          <w:szCs w:val="32"/>
-        </w:rPr>
-        <w:t xml:space="preserve"> }}</w:t>
+        <w:t>{{ max_participants }}</w:t>
       </w:r>
     </w:p>
     <w:p>
@@ -1792,7 +1685,7 @@
 </file>
 
 <file path=word/numbering.xml><?xml version="1.0" encoding="utf-8"?>
-<w:numbering xmlns:wpc="http://schemas.microsoft.com/office/word/2010/wordprocessingCanvas" xmlns:cx="http://schemas.microsoft.com/office/drawing/2014/chartex" xmlns:cx1="http://schemas.microsoft.com/office/drawing/2015/9/8/chartex" xmlns:cx2="http://schemas.microsoft.com/office/drawing/2015/10/21/chartex" xmlns:cx3="http://schemas.microsoft.com/office/drawing/2016/5/9/chartex" xmlns:cx4="http://schemas.microsoft.com/office/drawing/2016/5/10/chartex" xmlns:cx5="http://schemas.microsoft.com/office/drawing/2016/5/11/chartex" xmlns:cx6="http://schemas.microsoft.com/office/drawing/2016/5/12/chartex" xmlns:cx7="http://schemas.microsoft.com/office/drawing/2016/5/13/chartex" xmlns:cx8="http://schemas.microsoft.com/office/drawing/2016/5/14/chartex" xmlns:mc="http://schemas.openxmlformats.org/markup-compatibility/2006" xmlns:aink="http://schemas.microsoft.com/office/drawing/2016/ink" xmlns:am3d="http://schemas.microsoft.com/office/drawing/2017/model3d" xmlns:o="urn:schemas-microsoft-com:office:office" xmlns:oel="http://schemas.microsoft.com/office/2019/extlst" xmlns:r="http://schemas.openxmlformats.org/officeDocument/2006/relationships" xmlns:m="http://schemas.openxmlformats.org/officeDocument/2006/math" xmlns:v="urn:schemas-microsoft-com:vml" xmlns:wp14="http://schemas.microsoft.com/office/word/2010/wordprocessingDrawing" xmlns:wp="http://schemas.openxmlformats.org/drawingml/2006/wordprocessingDrawing" xmlns:w10="urn:schemas-microsoft-com:office:word" xmlns:w="http://schemas.openxmlformats.org/wordprocessingml/2006/main" xmlns:w14="http://schemas.microsoft.com/office/word/2010/wordml" xmlns:w15="http://schemas.microsoft.com/office/word/2012/wordml" xmlns:w16cex="http://schemas.microsoft.com/office/word/2018/wordml/cex" xmlns:w16cid="http://schemas.microsoft.com/office/word/2016/wordml/cid" xmlns:w16="http://schemas.microsoft.com/office/word/2018/wordml" xmlns:w16du="http://schemas.microsoft.com/office/word/2023/wordml/word16du" xmlns:w16sdtdh="http://schemas.microsoft.com/office/word/2020/wordml/sdtdatahash" xmlns:w16sdtfl="http://schemas.microsoft.com/office/word/2024/wordml/sdtformatlock" xmlns:w16se="http://schemas.microsoft.com/office/word/2015/wordml/symex" xmlns:wpg="http://schemas.microsoft.com/office/word/2010/wordprocessingGroup" xmlns:wpi="http://schemas.microsoft.com/office/word/2010/wordprocessingInk" xmlns:wne="http://schemas.microsoft.com/office/word/2006/wordml" xmlns:wps="http://schemas.microsoft.com/office/word/2010/wordprocessingShape" mc:Ignorable="w14 w15 w16se w16cid w16 w16cex w16sdtdh w16sdtfl w16du wp14">
+<w:numbering xmlns:wpc="http://schemas.microsoft.com/office/word/2010/wordprocessingCanvas" xmlns:cx="http://schemas.microsoft.com/office/drawing/2014/chartex" xmlns:cx1="http://schemas.microsoft.com/office/drawing/2015/9/8/chartex" xmlns:cx2="http://schemas.microsoft.com/office/drawing/2015/10/21/chartex" xmlns:cx3="http://schemas.microsoft.com/office/drawing/2016/5/9/chartex" xmlns:cx4="http://schemas.microsoft.com/office/drawing/2016/5/10/chartex" xmlns:cx5="http://schemas.microsoft.com/office/drawing/2016/5/11/chartex" xmlns:cx6="http://schemas.microsoft.com/office/drawing/2016/5/12/chartex" xmlns:cx7="http://schemas.microsoft.com/office/drawing/2016/5/13/chartex" xmlns:cx8="http://schemas.microsoft.com/office/drawing/2016/5/14/chartex" xmlns:mc="http://schemas.openxmlformats.org/markup-compatibility/2006" xmlns:aink="http://schemas.microsoft.com/office/drawing/2016/ink" xmlns:am3d="http://schemas.microsoft.com/office/drawing/2017/model3d" xmlns:o="urn:schemas-microsoft-com:office:office" xmlns:oel="http://schemas.microsoft.com/office/2019/extlst" xmlns:r="http://schemas.openxmlformats.org/officeDocument/2006/relationships" xmlns:m="http://schemas.openxmlformats.org/officeDocument/2006/math" xmlns:v="urn:schemas-microsoft-com:vml" xmlns:wp14="http://schemas.microsoft.com/office/word/2010/wordprocessingDrawing" xmlns:wp="http://schemas.openxmlformats.org/drawingml/2006/wordprocessingDrawing" xmlns:w10="urn:schemas-microsoft-com:office:word" xmlns:w="http://schemas.openxmlformats.org/wordprocessingml/2006/main" xmlns:w14="http://schemas.microsoft.com/office/word/2010/wordml" xmlns:w15="http://schemas.microsoft.com/office/word/2012/wordml" xmlns:w16cei="http://schemas.microsoft.com/office/word/2026/wordml/cei" xmlns:w16cex="http://schemas.microsoft.com/office/word/2018/wordml/cex" xmlns:w16cid="http://schemas.microsoft.com/office/word/2016/wordml/cid" xmlns:w16="http://schemas.microsoft.com/office/word/2018/wordml" xmlns:w16du="http://schemas.microsoft.com/office/word/2023/wordml/word16du" xmlns:w16sdtdh="http://schemas.microsoft.com/office/word/2020/wordml/sdtdatahash" xmlns:w16sdtfl="http://schemas.microsoft.com/office/word/2024/wordml/sdtformatlock" xmlns:w16se="http://schemas.microsoft.com/office/word/2015/wordml/symex" xmlns:wpg="http://schemas.microsoft.com/office/word/2010/wordprocessingGroup" xmlns:wpi="http://schemas.microsoft.com/office/word/2010/wordprocessingInk" xmlns:wne="http://schemas.microsoft.com/office/word/2006/wordml" xmlns:wps="http://schemas.microsoft.com/office/word/2010/wordprocessingShape" mc:Ignorable="w14 w15 w16se w16cid w16 w16cex w16sdtdh w16sdtfl w16du wp14">
   <w:abstractNum w:abstractNumId="0" w15:restartNumberingAfterBreak="0">
     <w:nsid w:val="2C6C5ED8"/>
     <w:multiLevelType w:val="hybridMultilevel"/>

</xml_diff>